<commit_message>
Financial Advisers: approved product list in the definition of professional services
The approved product list is now part of the definition of professional services, with a
new definition of Approved product, as in the better market wordings. The Approved
Product List Condition endorsement is removed. Advice to switch to an approved product,
and to continue holding any product, is always included (RG 126.42). A licensee without a
list is scheduled as such and every authorised product is then an approved product.

Co-Authored-By: Claude Opus 5.5 <noreply@anthropic.com>
Claude-Session: https://claude.ai/code/session_013jQuKLkqWzmefkpkRz1sNQ
</commit_message>
<xml_diff>
--- a/wordings/downloads/Meridian_FS_Financial_Advisers_Endorsement_v1.0.0-DRAFT.docx
+++ b/wordings/downloads/Meridian_FS_Financial_Advisers_Endorsement_v1.0.0-DRAFT.docx
@@ -218,7 +218,7 @@
           <w:b w:val="0"/>
           <w:i w:val="0"/>
         </w:rPr>
-        <w:t>The following services, to the extent that you are authorised to provide them under the Australian financial services licence shown in the schedule, or as an authorised representative of the licensee shown in the schedule:</w:t>
+        <w:t>The following services, provided for a fee or other remuneration, to the extent that you are authorised to provide them under the Australian financial services licence shown in the schedule, or as an authorised representative of the licensee shown in the schedule:</w:t>
       </w:r>
     </w:p>
     <w:p>
@@ -227,7 +227,21 @@
           <w:b w:val="0"/>
           <w:i w:val="0"/>
         </w:rPr>
-        <w:t>(a) personal and general advice on financial products, including superannuation, self-managed superannuation funds, managed investments, securities, life risk insurance and retirement income products;</w:t>
+        <w:t xml:space="preserve">(a) personal and general advice on, and arranging or dealing in, </w:t>
+      </w:r>
+      <w:r>
+        <w:rPr>
+          <w:b/>
+          <w:i w:val="0"/>
+        </w:rPr>
+        <w:t>approved products</w:t>
+      </w:r>
+      <w:r>
+        <w:rPr>
+          <w:b w:val="0"/>
+          <w:i w:val="0"/>
+        </w:rPr>
+        <w:t>, including superannuation, self-managed superannuation funds, managed investments, securities, life risk insurance and retirement income products;</w:t>
       </w:r>
     </w:p>
     <w:p>
@@ -236,7 +250,7 @@
           <w:b w:val="0"/>
           <w:i w:val="0"/>
         </w:rPr>
-        <w:t>(b) financial planning, including strategy advice on investment, superannuation, retirement, estate planning, debt and cash flow;</w:t>
+        <w:t>(b) financial planning strategy advice on investment, superannuation, retirement, estate planning, debt and cash flow, including where the strategy does not involve a particular financial product;</w:t>
       </w:r>
     </w:p>
     <w:p>
@@ -245,7 +259,7 @@
           <w:b w:val="0"/>
           <w:i w:val="0"/>
         </w:rPr>
-        <w:t>(c) arranging or dealing in financial products for your clients;</w:t>
+        <w:t>(c) advice to switch from a financial product that is not an approved product to an approved product;</w:t>
       </w:r>
     </w:p>
     <w:p>
@@ -254,7 +268,7 @@
           <w:b w:val="0"/>
           <w:i w:val="0"/>
         </w:rPr>
-        <w:t>(d) tax (financial) advice provided by a qualified tax relevant provider; and</w:t>
+        <w:t>(d) advice to continue holding a financial product, or to reduce or dispose of it, whether or not it is an approved product;</w:t>
       </w:r>
     </w:p>
     <w:p>
@@ -263,7 +277,7 @@
           <w:b w:val="0"/>
           <w:i w:val="0"/>
         </w:rPr>
-        <w:t>(e) any other service shown in the schedule as a professional service.</w:t>
+        <w:t>(e) tax (financial) advice provided by a qualified tax relevant provider; and</w:t>
       </w:r>
     </w:p>
     <w:p>
@@ -272,7 +286,7 @@
           <w:b w:val="0"/>
           <w:i w:val="0"/>
         </w:rPr>
-        <w:t>Advice to switch from one financial product to another, or to continue holding a financial product, is a professional service whether or not either product is on your approved product list.</w:t>
+        <w:t>(f) any other service shown in the schedule as a professional service.</w:t>
       </w:r>
     </w:p>
     <w:p>
@@ -285,9 +299,77 @@
           <w:color w:val="1C1915"/>
           <w:sz w:val="32"/>
         </w:rPr>
+        <w:t>Added: Approved product</w:t>
+      </w:r>
+      <w:bookmarkEnd w:id="2"/>
+    </w:p>
+    <w:p>
+      <w:r>
+        <w:rPr>
+          <w:b w:val="0"/>
+          <w:i w:val="0"/>
+        </w:rPr>
+        <w:t>The following definition is added to the base wording, after the definition of AFCA.</w:t>
+      </w:r>
+    </w:p>
+    <w:p>
+      <w:r>
+        <w:rPr>
+          <w:b/>
+          <w:i w:val="0"/>
+        </w:rPr>
+        <w:t>Approved product</w:t>
+      </w:r>
+    </w:p>
+    <w:p>
+      <w:r>
+        <w:rPr>
+          <w:b w:val="0"/>
+          <w:i w:val="0"/>
+        </w:rPr>
+        <w:t>A financial product that, when the advice was given or the service provided:</w:t>
+      </w:r>
+    </w:p>
+    <w:p>
+      <w:r>
+        <w:rPr>
+          <w:b w:val="0"/>
+          <w:i w:val="0"/>
+        </w:rPr>
+        <w:t>(a) was on the approved product list maintained by the licensee shown in the schedule, under a documented research and approval process; or</w:t>
+      </w:r>
+    </w:p>
+    <w:p>
+      <w:r>
+        <w:rPr>
+          <w:b w:val="0"/>
+          <w:i w:val="0"/>
+        </w:rPr>
+        <w:t>(b) had been researched and approved in writing by the licensee for the particular client, under that process.</w:t>
+      </w:r>
+    </w:p>
+    <w:p>
+      <w:r>
+        <w:rPr>
+          <w:b w:val="0"/>
+          <w:i w:val="0"/>
+        </w:rPr>
+        <w:t>If the schedule states that the licensee does not maintain an approved product list, every financial product that you are authorised to advise on is an approved product.</w:t>
+      </w:r>
+    </w:p>
+    <w:p>
+      <w:bookmarkStart w:id="3" w:name="c_end_2"/>
+      <w:r>
+        <w:rPr>
+          <w:rFonts w:ascii="Georgia" w:hAnsi="Georgia" w:eastAsia="Georgia"/>
+          <w:b/>
+          <w:i w:val="0"/>
+          <w:color w:val="1C1915"/>
+          <w:sz w:val="32"/>
+        </w:rPr>
         <w:t>Added: Product Issuer Failure</w:t>
       </w:r>
-      <w:bookmarkEnd w:id="2"/>
+      <w:bookmarkEnd w:id="3"/>
     </w:p>
     <w:p>
       <w:r>
@@ -326,7 +408,7 @@
       </w:r>
     </w:p>
     <w:p>
-      <w:bookmarkStart w:id="3" w:name="c_end_2"/>
+      <w:bookmarkStart w:id="4" w:name="c_end_3"/>
       <w:r>
         <w:rPr>
           <w:rFonts w:ascii="Georgia" w:hAnsi="Georgia" w:eastAsia="Georgia"/>
@@ -337,7 +419,7 @@
         </w:rPr>
         <w:t>Added: Market Participants</w:t>
       </w:r>
-      <w:bookmarkEnd w:id="3"/>
+      <w:bookmarkEnd w:id="4"/>
     </w:p>
     <w:p>
       <w:r>
@@ -376,7 +458,7 @@
       </w:r>
     </w:p>
     <w:p>
-      <w:bookmarkStart w:id="4" w:name="c_end_3"/>
+      <w:bookmarkStart w:id="5" w:name="c_end_4"/>
       <w:r>
         <w:rPr>
           <w:rFonts w:ascii="Georgia" w:hAnsi="Georgia" w:eastAsia="Georgia"/>
@@ -387,7 +469,7 @@
         </w:rPr>
         <w:t>Financial Advisers Endorsements</w:t>
       </w:r>
-      <w:bookmarkEnd w:id="4"/>
+      <w:bookmarkEnd w:id="5"/>
     </w:p>
     <w:p>
       <w:r>
@@ -405,38 +487,6 @@
           <w:i w:val="0"/>
         </w:rPr>
         <w:t>An endorsement does not apply to the extent that it would exclude cover that ASIC Regulatory Guide 126 requires the policy to provide, including AFCA determinations, the conduct of your representatives, and the fraud or dishonesty of your officers, employees and representatives.</w:t>
-      </w:r>
-    </w:p>
-    <w:p>
-      <w:bookmarkStart w:id="5" w:name="c_end_4"/>
-      <w:r>
-        <w:rPr>
-          <w:rFonts w:ascii="Georgia" w:hAnsi="Georgia" w:eastAsia="Georgia"/>
-          <w:b/>
-          <w:i w:val="0"/>
-          <w:color w:val="1C1915"/>
-          <w:sz w:val="32"/>
-        </w:rPr>
-        <w:t>Approved Product List Condition</w:t>
-      </w:r>
-      <w:bookmarkEnd w:id="5"/>
-    </w:p>
-    <w:p>
-      <w:r>
-        <w:rPr>
-          <w:b w:val="0"/>
-          <w:i w:val="0"/>
-        </w:rPr>
-        <w:t>For advice to acquire a financial product, we cover you only if the product was on your approved product list when the advice was given, or you had completed and recorded your own review of the product before the advice was given.</w:t>
-      </w:r>
-    </w:p>
-    <w:p>
-      <w:r>
-        <w:rPr>
-          <w:b w:val="0"/>
-          <w:i w:val="0"/>
-        </w:rPr>
-        <w:t>This endorsement does not apply to advice to switch from a product to one on your approved product list, or to continue holding a product, or to advice on a product the client already held.</w:t>
       </w:r>
     </w:p>
     <w:p>

</xml_diff>